<commit_message>
Update timestamp for Babelfish v.5.4.0 (17.7) and v.4.8.0 (16.11)
Signed-off-by: Rohit Bhagat <rohitbgt@amazon.com>
</commit_message>
<xml_diff>
--- a/BabelfishCompass_UserGuide.docx
+++ b/BabelfishCompass_UserGuide.docx
@@ -5866,7 +5866,19 @@
               <w:rPr>
                 <w:bCs/>
               </w:rPr>
-              <w:t>2026-01</w:t>
+              <w:t>2025</w:t>
+            </w:r>
+            <w:r>
+              <w:rPr>
+                <w:bCs/>
+              </w:rPr>
+              <w:t>-</w:t>
+            </w:r>
+            <w:r>
+              <w:rPr>
+                <w:bCs/>
+              </w:rPr>
+              <w:t>12</w:t>
             </w:r>
           </w:p>
         </w:tc>

</xml_diff>

<commit_message>
Support for Babelfish v.5.5.0 (17.8)
Signed-off-by: Yashneet Vinayak <>
</commit_message>
<xml_diff>
--- a/BabelfishCompass_UserGuide.docx
+++ b/BabelfishCompass_UserGuide.docx
@@ -5846,6 +5846,46 @@
             </w:r>
             <w:r>
               <w:t xml:space="preserve">) </w:t>
+            </w:r>
+          </w:p>
+        </w:tc>
+      </w:tr>
+      <w:tr>
+        <w:tc>
+          <w:tcPr>
+            <w:tcW w:w="3397" w:type="dxa"/>
+          </w:tcPr>
+          <w:p>
+            <w:pPr>
+              <w:pStyle w:val="BodyText"/>
+              <w:rPr>
+                <w:bCs/>
+              </w:rPr>
+            </w:pPr>
+            <w:r>
+              <w:rPr>
+                <w:bCs/>
+              </w:rPr>
+              <w:t>2026-03</w:t>
+            </w:r>
+          </w:p>
+        </w:tc>
+        <w:tc>
+          <w:tcPr>
+            <w:tcW w:w="6237" w:type="dxa"/>
+          </w:tcPr>
+          <w:p>
+            <w:pPr>
+              <w:pStyle w:val="BodyText"/>
+              <w:rPr>
+                <w:bCs/>
+              </w:rPr>
+            </w:pPr>
+            <w:r>
+              <w:rPr>
+                <w:bCs/>
+              </w:rPr>
+              <w:t>6.0.x (PG 18.2), 5.5.x (PG 17.8)</w:t>
             </w:r>
           </w:p>
         </w:tc>
@@ -6388,6 +6428,7 @@
               <w:pStyle w:val="BodyText"/>
             </w:pPr>
             <w:r>
+              <w:lastRenderedPageBreak/>
               <w:t xml:space="preserve">1.2 </w:t>
             </w:r>
             <w:r>
@@ -6422,7 +6463,6 @@
               <w:pStyle w:val="BodyText"/>
             </w:pPr>
             <w:r>
-              <w:lastRenderedPageBreak/>
               <w:t>1.0, 1.1</w:t>
             </w:r>
           </w:p>

</xml_diff>

<commit_message>
Support for Babelfish v.5.5.0 (17.9) (#154)
* Support for Babelfish v.5.5.0 (17.8)

Signed-off-by: Yashneet Vinayak <>

* Added function: fn_varbintohexstr

Signed-off-by: Yashneet Vinayak <>

* added support for polygon

Signed-off-by: Yashneet Vinayak <>

---------

Signed-off-by: Yashneet Vinayak <>
Co-authored-by: Yashneet Vinayak <>
Co-authored-by: Mohit Raj <mrxmohit@amazon.com>
</commit_message>
<xml_diff>
--- a/BabelfishCompass_UserGuide.docx
+++ b/BabelfishCompass_UserGuide.docx
@@ -5846,6 +5846,64 @@
             </w:r>
             <w:r>
               <w:t xml:space="preserve">) </w:t>
+            </w:r>
+          </w:p>
+        </w:tc>
+      </w:tr>
+      <w:tr>
+        <w:tc>
+          <w:tcPr>
+            <w:tcW w:w="3397" w:type="dxa"/>
+          </w:tcPr>
+          <w:p>
+            <w:pPr>
+              <w:pStyle w:val="BodyText"/>
+              <w:rPr>
+                <w:bCs/>
+              </w:rPr>
+            </w:pPr>
+            <w:r>
+              <w:rPr>
+                <w:bCs/>
+              </w:rPr>
+              <w:t>2026-0</w:t>
+            </w:r>
+            <w:r>
+              <w:rPr>
+                <w:bCs/>
+              </w:rPr>
+              <w:t>4</w:t>
+            </w:r>
+          </w:p>
+        </w:tc>
+        <w:tc>
+          <w:tcPr>
+            <w:tcW w:w="6237" w:type="dxa"/>
+          </w:tcPr>
+          <w:p>
+            <w:pPr>
+              <w:pStyle w:val="BodyText"/>
+              <w:rPr>
+                <w:bCs/>
+              </w:rPr>
+            </w:pPr>
+            <w:r>
+              <w:rPr>
+                <w:bCs/>
+              </w:rPr>
+              <w:t>5.5.x (PG 17.</w:t>
+            </w:r>
+            <w:r>
+              <w:rPr>
+                <w:bCs/>
+              </w:rPr>
+              <w:t>9</w:t>
+            </w:r>
+            <w:r>
+              <w:rPr>
+                <w:bCs/>
+              </w:rPr>
+              <w:t>)</w:t>
             </w:r>
           </w:p>
         </w:tc>
@@ -6388,6 +6446,7 @@
               <w:pStyle w:val="BodyText"/>
             </w:pPr>
             <w:r>
+              <w:lastRenderedPageBreak/>
               <w:t xml:space="preserve">1.2 </w:t>
             </w:r>
             <w:r>
@@ -6422,7 +6481,6 @@
               <w:pStyle w:val="BodyText"/>
             </w:pPr>
             <w:r>
-              <w:lastRenderedPageBreak/>
               <w:t>1.0, 1.1</w:t>
             </w:r>
           </w:p>

</xml_diff>

<commit_message>
Fix version ordering and update user guide to 2026-07
Signed-off-by: Mohit Raj <mrxmohit@amazon.com>
</commit_message>
<xml_diff>
--- a/BabelfishCompass_UserGuide.docx
+++ b/BabelfishCompass_UserGuide.docx
@@ -5872,7 +5872,7 @@
               <w:rPr>
                 <w:bCs/>
               </w:rPr>
-              <w:t>6</w:t>
+              <w:t>7</w:t>
             </w:r>
           </w:p>
         </w:tc>
@@ -5887,18 +5887,6 @@
                 <w:bCs/>
               </w:rPr>
             </w:pPr>
-            <w:r>
-              <w:rPr>
-                <w:bCs/>
-              </w:rPr>
-              <w:t>6.0.x (PG 18.3)</w:t>
-            </w:r>
-            <w:r>
-              <w:rPr>
-                <w:bCs/>
-              </w:rPr>
-              <w:t xml:space="preserve">, </w:t>
-            </w:r>
             <w:r>
               <w:rPr>
                 <w:bCs/>
@@ -5933,37 +5921,53 @@
               <w:rPr>
                 <w:bCs/>
               </w:rPr>
-              <w:t xml:space="preserve">, </w:t>
+              <w:t>, 6.1.x (PG 18.4)</w:t>
+            </w:r>
+          </w:p>
+        </w:tc>
+      </w:tr>
+      <w:tr>
+        <w:tc>
+          <w:tcPr>
+            <w:tcW w:w="3397" w:type="dxa"/>
+          </w:tcPr>
+          <w:p>
+            <w:pPr>
+              <w:pStyle w:val="BodyText"/>
+              <w:rPr>
+                <w:bCs/>
+              </w:rPr>
+            </w:pPr>
+            <w:r>
+              <w:rPr>
+                <w:bCs/>
+              </w:rPr>
+              <w:t>2026-0</w:t>
             </w:r>
             <w:r>
               <w:rPr>
                 <w:bCs/>
               </w:rPr>
-              <w:t>6.</w:t>
+              <w:t>6</w:t>
             </w:r>
+          </w:p>
+        </w:tc>
+        <w:tc>
+          <w:tcPr>
+            <w:tcW w:w="6237" w:type="dxa"/>
+          </w:tcPr>
+          <w:p>
+            <w:pPr>
+              <w:pStyle w:val="BodyText"/>
+              <w:rPr>
+                <w:bCs/>
+              </w:rPr>
+            </w:pPr>
             <w:r>
               <w:rPr>
                 <w:bCs/>
               </w:rPr>
-              <w:t>1</w:t>
-            </w:r>
-            <w:r>
-              <w:rPr>
-                <w:bCs/>
-              </w:rPr>
-              <w:t>.x (PG 18.</w:t>
-            </w:r>
-            <w:r>
-              <w:rPr>
-                <w:bCs/>
-              </w:rPr>
-              <w:t>4</w:t>
-            </w:r>
-            <w:r>
-              <w:rPr>
-                <w:bCs/>
-              </w:rPr>
-              <w:t>)</w:t>
+              <w:t>6.0.x (PG 18.3)</w:t>
             </w:r>
           </w:p>
         </w:tc>
@@ -6508,6 +6512,7 @@
               <w:pStyle w:val="BodyText"/>
             </w:pPr>
             <w:r>
+              <w:lastRenderedPageBreak/>
               <w:t>2022-03, 2022-04</w:t>
             </w:r>
           </w:p>
@@ -6536,7 +6541,6 @@
               <w:pStyle w:val="BodyText"/>
             </w:pPr>
             <w:r>
-              <w:lastRenderedPageBreak/>
               <w:t>2022-02</w:t>
             </w:r>
           </w:p>

</xml_diff>